<commit_message>
feat: execute Oracle core SQL coverage tranche
</commit_message>
<xml_diff>
--- a/docs/milestones/MS-50/MS-50.docx
+++ b/docs/milestones/MS-50/MS-50.docx
@@ -140,7 +140,7 @@
               <w:rPr>
                 <w:rFonts w:ascii="Arial" w:hAnsi="Arial"/>
               </w:rPr>
-              <w:t>0.50.0</w:t>
+              <w:t>0.50.0, 0.50.1</w:t>
             </w:r>
           </w:p>
         </w:tc>
@@ -246,7 +246,7 @@
     </w:p>
     <w:p>
       <w:r>
-        <w:t>MS #50 - Oracle Semantic Coverage Program converts a specific part of the LIGHTYEAR modernization approach into a governed, reviewable capability. Gives database architects a quantified, evidence-levelled Oracle coverage answer instead of presenting eight mechanism fixtures as broad support.</w:t>
+        <w:t>MS #50 - Oracle Semantic Coverage Program converts a specific part of the LIGHTYEAR modernization approach into a governed, reviewable capability. Gives database architects a quantified, evidence-levelled Oracle coverage answer and advances it through a broad, executable core SQL and datatype tranche.</w:t>
       </w:r>
     </w:p>
     <w:p>
@@ -259,7 +259,7 @@
     </w:p>
     <w:p>
       <w:r>
-        <w:t>Gives database architects a quantified, evidence-levelled Oracle coverage answer instead of presenting eight mechanism fixtures as broad support.</w:t>
+        <w:t>Gives database architects a quantified, evidence-levelled Oracle coverage answer and advances it through a broad, executable core SQL and datatype tranche.</w:t>
       </w:r>
     </w:p>
     <w:p>
@@ -296,7 +296,7 @@
         <w:pStyle w:val="ListBullet"/>
       </w:pPr>
       <w:r>
-        <w:t>Bindings from the eight MS #49 fixtures to exact behavior IDs without promoting bounded-model results into native evidence.</w:t>
+        <w:t>Bounded execution of 920 governed cases across all 230 behaviors in types, globalization, expressions, and queries.</w:t>
       </w:r>
     </w:p>
     <w:p>
@@ -304,7 +304,7 @@
         <w:pStyle w:val="ListBullet"/>
       </w:pPr>
       <w:r>
-        <w:t>An evidence ladder reporting 500 catalogued, 8 bounded-model verified, 0 native-verified, and 0 target-equivalent behaviors.</w:t>
+        <w:t>Separately declared expectations and independently computed observations across 46 topic families, five behavior focuses, and four case dimensions.</w:t>
       </w:r>
     </w:p>
     <w:p>
@@ -312,7 +312,15 @@
         <w:pStyle w:val="ListBullet"/>
       </w:pPr>
       <w:r>
-        <w:t>Deterministic artifacts, two JSON Schemas, cross-platform verification, and adversarial drift and overclaim tests.</w:t>
+        <w:t>A deduplicated evidence ladder reporting 500 catalogued, 233 unique bounded-model verified, 0 native-verified, and 0 target-equivalent behaviors.</w:t>
+      </w:r>
+    </w:p>
+    <w:p>
+      <w:pPr>
+        <w:pStyle w:val="ListBullet"/>
+      </w:pPr>
+      <w:r>
+        <w:t>A native execution plan plus deterministic artifacts, four JSON Schemas, cross-platform verification, and adversarial drift, mutation, overlap, and overclaim tests.</w:t>
       </w:r>
     </w:p>
     <w:p>
@@ -325,7 +333,7 @@
     </w:p>
     <w:p>
       <w:r>
-        <w:t>MS #49 proved the mechanism with eight fixtures and 24 cases. MS #50 makes them bootstrap evidence inside a governed broad-coverage program.</w:t>
+        <w:t>MS #49 proved the mechanism with eight fixtures and 24 cases. MS #50.0 made them bootstrap evidence inside a governed broad-coverage program; MS #50.1 executes the first 920 catalog cases without promoting bounded-model evidence into native Oracle proof.</w:t>
       </w:r>
     </w:p>
     <w:p>
@@ -382,7 +390,23 @@
         <w:pStyle w:val="ListBullet"/>
       </w:pPr>
       <w:r>
-        <w:t>The 500 behaviors and 2,000 cases are governed obligations, not implemented or executed capabilities; only 24 bootstrap cases have bounded-model evidence.</w:t>
+        <w:t>The 920 passed catalog cases are deterministic bounded-model evidence; they do not constitute native Oracle execution or conformance.</w:t>
+      </w:r>
+    </w:p>
+    <w:p>
+      <w:pPr>
+        <w:pStyle w:val="ListBullet"/>
+      </w:pPr>
+      <w:r>
+        <w:t>The remaining 1,080 catalog cases have not executed.</w:t>
+      </w:r>
+    </w:p>
+    <w:p>
+      <w:pPr>
+        <w:pStyle w:val="ListBullet"/>
+      </w:pPr>
+      <w:r>
+        <w:t>The 24 MS #49 bootstrap runs remain separate evidence records; five behavior bindings overlap the core tranche and are not double-counted.</w:t>
       </w:r>
     </w:p>
     <w:p>
@@ -430,7 +454,7 @@
         <w:pStyle w:val="ListBullet"/>
       </w:pPr>
       <w:r>
-        <w:t>CHANGELOG.md release section(s): 0.50.0</w:t>
+        <w:t>CHANGELOG.md release section(s): 0.50.0, 0.50.1</w:t>
       </w:r>
     </w:p>
     <w:p>

</xml_diff>

<commit_message>
feat: execute Oracle PL/SQL coverage tranche
</commit_message>
<xml_diff>
--- a/docs/milestones/MS-50/MS-50.docx
+++ b/docs/milestones/MS-50/MS-50.docx
@@ -140,7 +140,7 @@
               <w:rPr>
                 <w:rFonts w:ascii="Arial" w:hAnsi="Arial"/>
               </w:rPr>
-              <w:t>0.50.0, 0.50.1</w:t>
+              <w:t>0.50.0, 0.50.1, 0.50.2</w:t>
             </w:r>
           </w:p>
         </w:tc>
@@ -246,7 +246,7 @@
     </w:p>
     <w:p>
       <w:r>
-        <w:t>MS #50 - Oracle Semantic Coverage Program converts a specific part of the LIGHTYEAR modernization approach into a governed, reviewable capability. Gives database architects a quantified, evidence-levelled Oracle coverage answer and advances it through a broad, executable core SQL and datatype tranche.</w:t>
+        <w:t>MS #50 - Oracle Semantic Coverage Program converts a specific part of the LIGHTYEAR modernization approach into a governed, reviewable capability. Gives database architects a quantified, evidence-levelled Oracle coverage answer and advances it through broad core SQL, datatype, and PL/SQL execution tranches.</w:t>
       </w:r>
     </w:p>
     <w:p>
@@ -259,7 +259,7 @@
     </w:p>
     <w:p>
       <w:r>
-        <w:t>Gives database architects a quantified, evidence-levelled Oracle coverage answer and advances it through a broad, executable core SQL and datatype tranche.</w:t>
+        <w:t>Gives database architects a quantified, evidence-levelled Oracle coverage answer and advances it through broad core SQL, datatype, and PL/SQL execution tranches.</w:t>
       </w:r>
     </w:p>
     <w:p>
@@ -288,7 +288,7 @@
         <w:pStyle w:val="ListBullet"/>
       </w:pPr>
       <w:r>
-        <w:t>Oracle documentation authority, a 19c baseline, a 26ai delta, and four required case dimensions for every behavior.</w:t>
+        <w:t>Bounded execution of 920 governed cases across 230 core SQL/type behaviors and 320 cases across all 80 PL/SQL behaviors.</w:t>
       </w:r>
     </w:p>
     <w:p>
@@ -296,7 +296,7 @@
         <w:pStyle w:val="ListBullet"/>
       </w:pPr>
       <w:r>
-        <w:t>Bounded execution of 920 governed cases across all 230 behaviors in types, globalization, expressions, and queries.</w:t>
+        <w:t>PL/SQL coverage spanning blocks, exceptions, parameter modes, package state, cursors, bulk operations, dynamic SQL, triggers, and autonomous transaction boundaries.</w:t>
       </w:r>
     </w:p>
     <w:p>
@@ -304,7 +304,7 @@
         <w:pStyle w:val="ListBullet"/>
       </w:pPr>
       <w:r>
-        <w:t>Separately declared expectations and independently computed observations across 46 topic families, five behavior focuses, and four case dimensions.</w:t>
+        <w:t>Separately declared expectations and independently computed observations across 62 topic families, five behavior focuses, and four case dimensions.</w:t>
       </w:r>
     </w:p>
     <w:p>
@@ -312,7 +312,7 @@
         <w:pStyle w:val="ListBullet"/>
       </w:pPr>
       <w:r>
-        <w:t>A deduplicated evidence ladder reporting 500 catalogued, 233 unique bounded-model verified, 0 native-verified, and 0 target-equivalent behaviors.</w:t>
+        <w:t>A deduplicated evidence ladder reporting 500 catalogued, 310 catalog-executed, 312 unique bounded-model verified, 0 native-verified, and 0 target-equivalent behaviors.</w:t>
       </w:r>
     </w:p>
     <w:p>
@@ -320,7 +320,7 @@
         <w:pStyle w:val="ListBullet"/>
       </w:pPr>
       <w:r>
-        <w:t>A native execution plan plus deterministic artifacts, four JSON Schemas, cross-platform verification, and adversarial drift, mutation, overlap, and overclaim tests.</w:t>
+        <w:t>Native execution plans plus deterministic artifacts, six JSON Schemas, cross-platform verification, and adversarial dependency-drift, mutation, overlap, and overclaim tests.</w:t>
       </w:r>
     </w:p>
     <w:p>
@@ -333,7 +333,7 @@
     </w:p>
     <w:p>
       <w:r>
-        <w:t>MS #49 proved the mechanism with eight fixtures and 24 cases. MS #50.0 made them bootstrap evidence inside a governed broad-coverage program; MS #50.1 executes the first 920 catalog cases without promoting bounded-model evidence into native Oracle proof.</w:t>
+        <w:t>MS #49 proved the mechanism with eight fixtures and 24 cases. MS #50.0 made them bootstrap evidence inside a governed broad-coverage program; MS #50.1 executes the first 920 core SQL/type catalog cases and MS #50.2 executes all 320 PL/SQL cases without promoting bounded-model evidence into native Oracle proof.</w:t>
       </w:r>
     </w:p>
     <w:p>
@@ -390,7 +390,7 @@
         <w:pStyle w:val="ListBullet"/>
       </w:pPr>
       <w:r>
-        <w:t>The 920 passed catalog cases are deterministic bounded-model evidence; they do not constitute native Oracle execution or conformance.</w:t>
+        <w:t>The 1,240 passed catalog cases are deterministic bounded-model evidence; they do not constitute native Oracle execution or conformance.</w:t>
       </w:r>
     </w:p>
     <w:p>
@@ -398,7 +398,7 @@
         <w:pStyle w:val="ListBullet"/>
       </w:pPr>
       <w:r>
-        <w:t>The remaining 1,080 catalog cases have not executed.</w:t>
+        <w:t>The remaining 760 catalog cases have not executed.</w:t>
       </w:r>
     </w:p>
     <w:p>
@@ -406,7 +406,15 @@
         <w:pStyle w:val="ListBullet"/>
       </w:pPr>
       <w:r>
-        <w:t>The 24 MS #49 bootstrap runs remain separate evidence records; five behavior bindings overlap the core tranche and are not double-counted.</w:t>
+        <w:t>The 24 MS #49 bootstrap runs remain separate evidence records; six behavior bindings overlap executed catalog tranches and two remain bootstrap-only.</w:t>
+      </w:r>
+    </w:p>
+    <w:p>
+      <w:pPr>
+        <w:pStyle w:val="ListBullet"/>
+      </w:pPr>
+      <w:r>
+        <w:t>Dynamic SQL, trigger, package-state, and autonomous transaction observations are bounded simulations, not native platform evidence.</w:t>
       </w:r>
     </w:p>
     <w:p>
@@ -430,15 +438,7 @@
         <w:pStyle w:val="ListBullet"/>
       </w:pPr>
       <w:r>
-        <w:t>iDempiere projection and CloudBank mapping remain incomplete.</w:t>
-      </w:r>
-    </w:p>
-    <w:p>
-      <w:pPr>
-        <w:pStyle w:val="ListBullet"/>
-      </w:pPr>
-      <w:r>
-        <w:t>Native conformance, application equivalence, migration completion, and production readiness remain false.</w:t>
+        <w:t>iDempiere projection, CloudBank mapping, application equivalence, migration completion, and production readiness remain false.</w:t>
       </w:r>
     </w:p>
     <w:p>
@@ -454,7 +454,7 @@
         <w:pStyle w:val="ListBullet"/>
       </w:pPr>
       <w:r>
-        <w:t>CHANGELOG.md release section(s): 0.50.0, 0.50.1</w:t>
+        <w:t>CHANGELOG.md release section(s): 0.50.0, 0.50.1, 0.50.2</w:t>
       </w:r>
     </w:p>
     <w:p>

</xml_diff>

<commit_message>
feat: execute Oracle transaction and CDC coverage tranche
</commit_message>
<xml_diff>
--- a/docs/milestones/MS-50/MS-50.docx
+++ b/docs/milestones/MS-50/MS-50.docx
@@ -140,7 +140,7 @@
               <w:rPr>
                 <w:rFonts w:ascii="Arial" w:hAnsi="Arial"/>
               </w:rPr>
-              <w:t>0.50.0, 0.50.1, 0.50.2</w:t>
+              <w:t>0.50.0, 0.50.1, 0.50.2, 0.50.3</w:t>
             </w:r>
           </w:p>
         </w:tc>
@@ -246,7 +246,7 @@
     </w:p>
     <w:p>
       <w:r>
-        <w:t>MS #50 - Oracle Semantic Coverage Program converts a specific part of the LIGHTYEAR modernization approach into a governed, reviewable capability. Gives database architects a quantified, evidence-levelled Oracle coverage answer and advances it through broad core SQL, datatype, and PL/SQL execution tranches.</w:t>
+        <w:t>MS #50 - Oracle Semantic Coverage Program converts a specific part of the LIGHTYEAR modernization approach into a governed, reviewable capability. Gives database architects a quantified, evidence-levelled Oracle coverage answer and advances it through broad core SQL, datatype, PL/SQL, transaction, and CDC execution tranches.</w:t>
       </w:r>
     </w:p>
     <w:p>
@@ -259,7 +259,7 @@
     </w:p>
     <w:p>
       <w:r>
-        <w:t>Gives database architects a quantified, evidence-levelled Oracle coverage answer and advances it through broad core SQL, datatype, and PL/SQL execution tranches.</w:t>
+        <w:t>Gives database architects a quantified, evidence-levelled Oracle coverage answer and advances it through broad core SQL, datatype, PL/SQL, transaction, and CDC execution tranches.</w:t>
       </w:r>
     </w:p>
     <w:p>
@@ -288,7 +288,7 @@
         <w:pStyle w:val="ListBullet"/>
       </w:pPr>
       <w:r>
-        <w:t>Bounded execution of 920 governed cases across 230 core SQL/type behaviors and 320 cases across all 80 PL/SQL behaviors.</w:t>
+        <w:t>Bounded execution of 920 governed core SQL/type cases, 320 PL/SQL cases, and 280 transaction and operations cases.</w:t>
       </w:r>
     </w:p>
     <w:p>
@@ -296,7 +296,7 @@
         <w:pStyle w:val="ListBullet"/>
       </w:pPr>
       <w:r>
-        <w:t>PL/SQL coverage spanning blocks, exceptions, parameter modes, package state, cursors, bulk operations, dynamic SQL, triggers, and autonomous transaction boundaries.</w:t>
+        <w:t>Transaction and operations coverage spanning commit, rollback, savepoints, isolation, locks, deadlocks, redo/LogMiner, metadata, session state, privileges, and diagnostics.</w:t>
       </w:r>
     </w:p>
     <w:p>
@@ -304,7 +304,7 @@
         <w:pStyle w:val="ListBullet"/>
       </w:pPr>
       <w:r>
-        <w:t>Separately declared expectations and independently computed observations across 62 topic families, five behavior focuses, and four case dimensions.</w:t>
+        <w:t>Separately declared expectations and independently computed observations across 76 topic families, five behavior focuses, and four case dimensions.</w:t>
       </w:r>
     </w:p>
     <w:p>
@@ -312,7 +312,7 @@
         <w:pStyle w:val="ListBullet"/>
       </w:pPr>
       <w:r>
-        <w:t>A deduplicated evidence ladder reporting 500 catalogued, 310 catalog-executed, 312 unique bounded-model verified, 0 native-verified, and 0 target-equivalent behaviors.</w:t>
+        <w:t>A deduplicated evidence ladder reporting 500 catalogued, 380 catalog-executed, 381 unique bounded-model verified, 0 native-verified, and 0 target-equivalent behaviors.</w:t>
       </w:r>
     </w:p>
     <w:p>
@@ -320,7 +320,7 @@
         <w:pStyle w:val="ListBullet"/>
       </w:pPr>
       <w:r>
-        <w:t>Native execution plans plus deterministic artifacts, six JSON Schemas, cross-platform verification, and adversarial dependency-drift, mutation, overlap, and overclaim tests.</w:t>
+        <w:t>Native execution plans plus deterministic artifacts, eight JSON Schemas, cross-platform verification, and adversarial dependency-drift, mutation, overlap, and overclaim tests.</w:t>
       </w:r>
     </w:p>
     <w:p>
@@ -333,7 +333,7 @@
     </w:p>
     <w:p>
       <w:r>
-        <w:t>MS #49 proved the mechanism with eight fixtures and 24 cases. MS #50.0 made them bootstrap evidence inside a governed broad-coverage program; MS #50.1 executes the first 920 core SQL/type catalog cases and MS #50.2 executes all 320 PL/SQL cases without promoting bounded-model evidence into native Oracle proof.</w:t>
+        <w:t>MS #49 proved the mechanism with eight fixtures and 24 cases. MS #50.0 made them bootstrap evidence inside a governed broad-coverage program; MS #50.1 executes 920 core SQL/type cases, MS #50.2 executes 320 PL/SQL cases, and MS #50.3 executes 280 transaction and operations cases without promoting bounded-model evidence into native Oracle proof.</w:t>
       </w:r>
     </w:p>
     <w:p>
@@ -390,7 +390,7 @@
         <w:pStyle w:val="ListBullet"/>
       </w:pPr>
       <w:r>
-        <w:t>The 1,240 passed catalog cases are deterministic bounded-model evidence; they do not constitute native Oracle execution or conformance.</w:t>
+        <w:t>The 1,520 passed catalog cases are deterministic bounded-model evidence; they do not constitute native Oracle execution or conformance.</w:t>
       </w:r>
     </w:p>
     <w:p>
@@ -398,7 +398,7 @@
         <w:pStyle w:val="ListBullet"/>
       </w:pPr>
       <w:r>
-        <w:t>The remaining 760 catalog cases have not executed.</w:t>
+        <w:t>The remaining 480 catalog cases have not executed.</w:t>
       </w:r>
     </w:p>
     <w:p>
@@ -406,7 +406,7 @@
         <w:pStyle w:val="ListBullet"/>
       </w:pPr>
       <w:r>
-        <w:t>The 24 MS #49 bootstrap runs remain separate evidence records; six behavior bindings overlap executed catalog tranches and two remain bootstrap-only.</w:t>
+        <w:t>The 24 MS #49 bootstrap runs remain separate evidence records; seven behavior bindings overlap executed catalog tranches and the LOB binding remains bootstrap-only.</w:t>
       </w:r>
     </w:p>
     <w:p>
@@ -414,7 +414,7 @@
         <w:pStyle w:val="ListBullet"/>
       </w:pPr>
       <w:r>
-        <w:t>Dynamic SQL, trigger, package-state, and autonomous transaction observations are bounded simulations, not native platform evidence.</w:t>
+        <w:t>Concurrency schedules, locks, redo/SCN, LogMiner, metadata visibility, privilege enforcement, and diagnostic observations are bounded simulations, not native platform evidence.</w:t>
       </w:r>
     </w:p>
     <w:p>
@@ -454,7 +454,7 @@
         <w:pStyle w:val="ListBullet"/>
       </w:pPr>
       <w:r>
-        <w:t>CHANGELOG.md release section(s): 0.50.0, 0.50.1, 0.50.2</w:t>
+        <w:t>CHANGELOG.md release section(s): 0.50.0, 0.50.1, 0.50.2, 0.50.3</w:t>
       </w:r>
     </w:p>
     <w:p>

</xml_diff>

<commit_message>
feat: execute Oracle schema and structured-data coverage tranche
</commit_message>
<xml_diff>
--- a/docs/milestones/MS-50/MS-50.docx
+++ b/docs/milestones/MS-50/MS-50.docx
@@ -140,7 +140,7 @@
               <w:rPr>
                 <w:rFonts w:ascii="Arial" w:hAnsi="Arial"/>
               </w:rPr>
-              <w:t>0.50.0, 0.50.1, 0.50.2, 0.50.3</w:t>
+              <w:t>0.50.0, 0.50.1, 0.50.2, 0.50.3, 0.50.4</w:t>
             </w:r>
           </w:p>
         </w:tc>
@@ -246,7 +246,7 @@
     </w:p>
     <w:p>
       <w:r>
-        <w:t>MS #50 - Oracle Semantic Coverage Program converts a specific part of the LIGHTYEAR modernization approach into a governed, reviewable capability. Gives database architects a quantified, evidence-levelled Oracle coverage answer and advances it through broad core SQL, datatype, PL/SQL, transaction, and CDC execution tranches.</w:t>
+        <w:t>MS #50 - Oracle Semantic Coverage Program converts a specific part of the LIGHTYEAR modernization approach into a governed, reviewable capability. Gives database architects a quantified, evidence-levelled Oracle coverage answer and completes bounded catalog execution across core SQL, datatypes, PL/SQL, transactions, operations, schema/DML, schema objects, and structured data.</w:t>
       </w:r>
     </w:p>
     <w:p>
@@ -259,7 +259,7 @@
     </w:p>
     <w:p>
       <w:r>
-        <w:t>Gives database architects a quantified, evidence-levelled Oracle coverage answer and advances it through broad core SQL, datatype, PL/SQL, transaction, and CDC execution tranches.</w:t>
+        <w:t>Gives database architects a quantified, evidence-levelled Oracle coverage answer and completes bounded catalog execution across core SQL, datatypes, PL/SQL, transactions, operations, schema/DML, schema objects, and structured data.</w:t>
       </w:r>
     </w:p>
     <w:p>
@@ -288,7 +288,7 @@
         <w:pStyle w:val="ListBullet"/>
       </w:pPr>
       <w:r>
-        <w:t>Bounded execution of 920 governed core SQL/type cases, 320 PL/SQL cases, and 280 transaction and operations cases.</w:t>
+        <w:t>Bounded execution of 920 governed core SQL/type cases, 320 PL/SQL cases, 280 transaction and operations cases, and 480 schema/DML, schema-object, and structured-data cases.</w:t>
       </w:r>
     </w:p>
     <w:p>
@@ -296,7 +296,7 @@
         <w:pStyle w:val="ListBullet"/>
       </w:pPr>
       <w:r>
-        <w:t>Transaction and operations coverage spanning commit, rollback, savepoints, isolation, locks, deadlocks, redo/LogMiner, metadata, session state, privileges, and diagnostics.</w:t>
+        <w:t>Schema and structured-data coverage spanning DML state changes, defaults, identity, constraints, indexes, schema evolution, views, sequences, synonyms, partitioning, materialized views, index-organized tables, editions, BLOB, CLOB, SecureFiles, JSON, XMLType, and object types.</w:t>
       </w:r>
     </w:p>
     <w:p>
@@ -304,7 +304,7 @@
         <w:pStyle w:val="ListBullet"/>
       </w:pPr>
       <w:r>
-        <w:t>Separately declared expectations and independently computed observations across 76 topic families, five behavior focuses, and four case dimensions.</w:t>
+        <w:t>Separately declared expectations and independently computed observations across 100 topic families, five behavior focuses, and four case dimensions.</w:t>
       </w:r>
     </w:p>
     <w:p>
@@ -312,7 +312,7 @@
         <w:pStyle w:val="ListBullet"/>
       </w:pPr>
       <w:r>
-        <w:t>A deduplicated evidence ladder reporting 500 catalogued, 380 catalog-executed, 381 unique bounded-model verified, 0 native-verified, and 0 target-equivalent behaviors.</w:t>
+        <w:t>A deduplicated evidence ladder reporting 500 catalogued, 500 catalog-executed, 500 unique bounded-model verified, 0 native-verified, and 0 target-equivalent behaviors, with 2,024 evidence records after retaining the 24 bootstrap runs separately.</w:t>
       </w:r>
     </w:p>
     <w:p>
@@ -320,7 +320,7 @@
         <w:pStyle w:val="ListBullet"/>
       </w:pPr>
       <w:r>
-        <w:t>Native execution plans plus deterministic artifacts, eight JSON Schemas, cross-platform verification, and adversarial dependency-drift, mutation, overlap, and overclaim tests.</w:t>
+        <w:t>Native execution plans plus deterministic artifacts, ten JSON Schemas, cross-platform verification, and adversarial dependency-drift, mutation, overlap, and overclaim tests.</w:t>
       </w:r>
     </w:p>
     <w:p>
@@ -333,7 +333,7 @@
     </w:p>
     <w:p>
       <w:r>
-        <w:t>MS #49 proved the mechanism with eight fixtures and 24 cases. MS #50.0 made them bootstrap evidence inside a governed broad-coverage program; MS #50.1 executes 920 core SQL/type cases, MS #50.2 executes 320 PL/SQL cases, and MS #50.3 executes 280 transaction and operations cases without promoting bounded-model evidence into native Oracle proof.</w:t>
+        <w:t>MS #49 proved the mechanism with eight fixtures and 24 cases. MS #50.0 made them bootstrap evidence inside a governed broad-coverage program; MS #50.1 executes 920 core SQL/type cases, MS #50.2 executes 320 PL/SQL cases, MS #50.3 executes 280 transaction and operations cases, and MS #50.4 executes the final 480 schema/DML, schema-object, and structured-data cases without promoting bounded-model evidence into native Oracle proof.</w:t>
       </w:r>
     </w:p>
     <w:p>
@@ -390,7 +390,7 @@
         <w:pStyle w:val="ListBullet"/>
       </w:pPr>
       <w:r>
-        <w:t>The 1,520 passed catalog cases are deterministic bounded-model evidence; they do not constitute native Oracle execution or conformance.</w:t>
+        <w:t>The 2,000 passed catalog cases are deterministic bounded-model evidence; they do not constitute native Oracle execution or conformance.</w:t>
       </w:r>
     </w:p>
     <w:p>
@@ -398,7 +398,7 @@
         <w:pStyle w:val="ListBullet"/>
       </w:pPr>
       <w:r>
-        <w:t>The remaining 480 catalog cases have not executed.</w:t>
+        <w:t>No governed catalog cases remain unexecuted, but native Oracle verified and target-equivalent behavior counts remain zero.</w:t>
       </w:r>
     </w:p>
     <w:p>
@@ -406,7 +406,7 @@
         <w:pStyle w:val="ListBullet"/>
       </w:pPr>
       <w:r>
-        <w:t>The 24 MS #49 bootstrap runs remain separate evidence records; seven behavior bindings overlap executed catalog tranches and the LOB binding remains bootstrap-only.</w:t>
+        <w:t>The 24 MS #49 bootstrap runs remain separate evidence records and all eight behavior bindings overlap executed catalog tranches.</w:t>
       </w:r>
     </w:p>
     <w:p>
@@ -414,7 +414,7 @@
         <w:pStyle w:val="ListBullet"/>
       </w:pPr>
       <w:r>
-        <w:t>Concurrency schedules, locks, redo/SCN, LogMiner, metadata visibility, privilege enforcement, and diagnostic observations are bounded simulations, not native platform evidence.</w:t>
+        <w:t>Physical storage and index behavior, partitioning, materialized-view refresh, edition visibility, SecureFiles and LOB locator semantics, native JSON/XML/object behavior, and the 19c-to-26ai JSON datatype delta remain bounded until authorized native evidence exists.</w:t>
       </w:r>
     </w:p>
     <w:p>
@@ -454,7 +454,7 @@
         <w:pStyle w:val="ListBullet"/>
       </w:pPr>
       <w:r>
-        <w:t>CHANGELOG.md release section(s): 0.50.0, 0.50.1, 0.50.2, 0.50.3</w:t>
+        <w:t>CHANGELOG.md release section(s): 0.50.0, 0.50.1, 0.50.2, 0.50.3, 0.50.4</w:t>
       </w:r>
     </w:p>
     <w:p>

</xml_diff>